<commit_message>
docs(contrat): variables docxtemplater insérées dans template mariage
</commit_message>
<xml_diff>
--- a/backend/assets/contrat-sauvageon.docx
+++ b/backend/assets/contrat-sauvageon.docx
@@ -424,7 +424,7 @@
           <w:szCs w:val="32"/>
           <w:rtl w:val="0"/>
         </w:rPr>
-        <w:t xml:space="preserve">Location Gestion libre du </w:t>
+        <w:t>Location Gestion libre du {dateDebut} AU {dateFin}</w:t>
       </w:r>
       <w:r>
         <w:rPr>
@@ -435,7 +435,6 @@
           <w:szCs w:val="32"/>
           <w:rtl w:val="0"/>
         </w:rPr>
-        <w:t xml:space="preserve">XX </w:t>
       </w:r>
       <w:r>
         <w:rPr>
@@ -445,7 +444,6 @@
           <w:szCs w:val="32"/>
           <w:rtl w:val="0"/>
         </w:rPr>
-        <w:t xml:space="preserve">AU </w:t>
       </w:r>
       <w:r>
         <w:rPr>
@@ -456,7 +454,6 @@
           <w:szCs w:val="32"/>
           <w:rtl w:val="0"/>
         </w:rPr>
-        <w:t xml:space="preserve">XX</w:t>
       </w:r>
       <w:r>
         <w:rPr>
@@ -592,7 +589,7 @@
           <w:szCs w:val="24"/>
           <w:rtl w:val="0"/>
         </w:rPr>
-        <w:t xml:space="preserve">Clients concernés :</w:t>
+        <w:t>Clients concernés : {nomClient} {prenomClient}</w:t>
       </w:r>
     </w:p>
     <w:p>
@@ -631,7 +628,7 @@
           <w:szCs w:val="21"/>
           <w:rtl w:val="0"/>
         </w:rPr>
-        <w:t xml:space="preserve">Adresse : </w:t>
+        <w:t>Adresse : {adresseClient}</w:t>
       </w:r>
       <w:r>
         <w:rPr>
@@ -642,7 +639,6 @@
           <w:szCs w:val="21"/>
           <w:rtl w:val="0"/>
         </w:rPr>
-        <w:t xml:space="preserve">XX</w:t>
       </w:r>
     </w:p>
     <w:p>
@@ -665,7 +661,7 @@
           <w:szCs w:val="21"/>
           <w:rtl w:val="0"/>
         </w:rPr>
-        <w:t xml:space="preserve">Port. : </w:t>
+        <w:t>Port. : {telClient}</w:t>
       </w:r>
       <w:r>
         <w:rPr>
@@ -676,7 +672,6 @@
           <w:szCs w:val="21"/>
           <w:rtl w:val="0"/>
         </w:rPr>
-        <w:t xml:space="preserve">XX</w:t>
       </w:r>
     </w:p>
     <w:p>
@@ -699,7 +694,7 @@
           <w:szCs w:val="21"/>
           <w:rtl w:val="0"/>
         </w:rPr>
-        <w:t xml:space="preserve">Email : </w:t>
+        <w:t>Email : {emailClient}</w:t>
       </w:r>
       <w:r>
         <w:rPr>
@@ -710,7 +705,6 @@
           <w:szCs w:val="21"/>
           <w:rtl w:val="0"/>
         </w:rPr>
-        <w:t xml:space="preserve">XX</w:t>
       </w:r>
     </w:p>
     <w:p>
@@ -2608,14 +2602,14 @@
           <w:szCs w:val="24"/>
           <w:rtl w:val="0"/>
         </w:rPr>
-        <w:t xml:space="preserve">Nom, Prénom, Date </w:t>
+        <w:t>{nomPrenomSignataire}</w:t>
         <w:tab/>
         <w:tab/>
         <w:tab/>
         <w:tab/>
         <w:tab/>
         <w:tab/>
-        <w:t xml:space="preserve">Fait à Morillon, le</w:t>
+        <w:t>Fait à Morillon, le {dateSignature}</w:t>
       </w:r>
     </w:p>
     <w:p>

</xml_diff>